<commit_message>
docs(repair): Tree Survey Fix — add U-02 REPAIR-HOME + T-45 WeeeT parcel (Advisor Gen 115)
- Table 0 (C1): insert U-02 REPAIR-HOME at R1 (entry shared C1/C2/C3/C6)
- Table 2 (C3): insert T-45 REPAIR-C3-PARCEL (WeeeT) after R-08 before U-53a
- Table 11 summary WeeeT: T-44 → T-44, T-45
- 9-col structure verified PASS · base: hub-integ-p2p3-v3 c151e53

Co-Authored-By: Claude Sonnet 4.6 <noreply@anthropic.com>
</commit_message>
<xml_diff>
--- a/docs/Repair_Module.docx
+++ b/docs/Repair_Module.docx
@@ -214,6 +214,134 @@
                 <w:rFonts w:ascii="Arial" w:hAnsi="Arial"/>
                 <w:sz w:val="16"/>
               </w:rPr>
+              <w:t>U-02</w:t>
+            </w:r>
+          </w:p>
+        </w:tc>
+        <w:tc>
+          <w:tcPr>
+            <w:tcW w:type="dxa" w:w="2154"/>
+          </w:tcPr>
+          <w:p>
+            <w:r>
+              <w:rPr>
+                <w:rFonts w:ascii="Arial" w:hAnsi="Arial"/>
+                <w:sz w:val="16"/>
+              </w:rPr>
+              <w:t>REPAIR-HOME (รายการซ่อม + ปุ่มแจ้งซ่อมใหม่)</w:t>
+            </w:r>
+          </w:p>
+        </w:tc>
+        <w:tc>
+          <w:tcPr>
+            <w:tcW w:type="dxa" w:w="1587"/>
+          </w:tcPr>
+          <w:p>
+            <w:r>
+              <w:rPr>
+                <w:rFonts w:ascii="Arial" w:hAnsi="Arial"/>
+                <w:sz w:val="16"/>
+              </w:rPr>
+              <w:t>U-01 Dashboard</w:t>
+            </w:r>
+          </w:p>
+        </w:tc>
+        <w:tc>
+          <w:tcPr>
+            <w:tcW w:type="dxa" w:w="2154"/>
+          </w:tcPr>
+          <w:p>
+            <w:r>
+              <w:rPr>
+                <w:rFonts w:ascii="Arial" w:hAnsi="Arial"/>
+                <w:sz w:val="16"/>
+              </w:rPr>
+              <w:t>เลือก service method: DROP_OFF/PICKUP/SHIPPING/ONSITE</w:t>
+            </w:r>
+          </w:p>
+        </w:tc>
+        <w:tc>
+          <w:tcPr>
+            <w:tcW w:type="dxa" w:w="1587"/>
+          </w:tcPr>
+          <w:p>
+            <w:r>
+              <w:rPr>
+                <w:rFonts w:ascii="Arial" w:hAnsi="Arial"/>
+                <w:sz w:val="16"/>
+              </w:rPr>
+              <w:t>U-02b (C1) / U-02c (C2) / U-03 (C3/C6)</w:t>
+            </w:r>
+          </w:p>
+        </w:tc>
+        <w:tc>
+          <w:tcPr>
+            <w:tcW w:type="dxa" w:w="1814"/>
+          </w:tcPr>
+          <w:p>
+            <w:r>
+              <w:rPr>
+                <w:rFonts w:ascii="Arial" w:hAnsi="Arial"/>
+                <w:sz w:val="16"/>
+              </w:rPr>
+              <w:t>WeeeR R-02 (announce ใหม่ปรากฏ)</w:t>
+            </w:r>
+          </w:p>
+        </w:tc>
+        <w:tc>
+          <w:tcPr>
+            <w:tcW w:type="dxa" w:w="794"/>
+          </w:tcPr>
+          <w:p>
+            <w:r>
+              <w:rPr>
+                <w:rFonts w:ascii="Arial" w:hAnsi="Arial"/>
+                <w:sz w:val="16"/>
+              </w:rPr>
+              <w:t>C1,C2,C3,C6</w:t>
+            </w:r>
+          </w:p>
+        </w:tc>
+        <w:tc>
+          <w:tcPr>
+            <w:tcW w:type="dxa" w:w="1928"/>
+          </w:tcPr>
+          <w:p>
+            <w:r>
+              <w:rPr>
+                <w:rFonts w:ascii="Arial" w:hAnsi="Arial"/>
+                <w:sz w:val="16"/>
+              </w:rPr>
+              <w:t>entry ร่วมทุก method</w:t>
+            </w:r>
+          </w:p>
+        </w:tc>
+        <w:tc>
+          <w:tcPr>
+            <w:tcW w:type="dxa" w:w="1134"/>
+          </w:tcPr>
+          <w:p>
+            <w:r>
+              <w:rPr>
+                <w:rFonts w:ascii="Arial" w:hAnsi="Arial"/>
+                <w:sz w:val="16"/>
+              </w:rPr>
+              <w:t>localhost:3002/repair</w:t>
+            </w:r>
+          </w:p>
+        </w:tc>
+      </w:tr>
+      <w:tr>
+        <w:tc>
+          <w:tcPr>
+            <w:tcW w:type="dxa" w:w="1020"/>
+          </w:tcPr>
+          <w:p>
+            <w:r>
+              <w:rPr>
+                <w:rFonts w:ascii="Arial" w:hAnsi="Arial"/>
+                <w:sz w:val="16"/>
+              </w:rPr>
               <w:t>U-02b</w:t>
             </w:r>
           </w:p>
@@ -3765,6 +3893,134 @@
                 <w:rFonts w:ascii="Arial" w:hAnsi="Arial"/>
                 <w:sz w:val="16"/>
               </w:rPr>
+              <w:t>T-45</w:t>
+            </w:r>
+          </w:p>
+        </w:tc>
+        <w:tc>
+          <w:tcPr>
+            <w:tcW w:type="dxa" w:w="2154"/>
+          </w:tcPr>
+          <w:p>
+            <w:r>
+              <w:rPr>
+                <w:rFonts w:ascii="Arial" w:hAnsi="Arial"/>
+                <w:sz w:val="16"/>
+              </w:rPr>
+              <w:t>REPAIR-C3-PARCEL (WeeeT ซ่อมพัสดุที่ได้รับ)</w:t>
+            </w:r>
+          </w:p>
+        </w:tc>
+        <w:tc>
+          <w:tcPr>
+            <w:tcW w:type="dxa" w:w="1587"/>
+          </w:tcPr>
+          <w:p>
+            <w:r>
+              <w:rPr>
+                <w:rFonts w:ascii="Arial" w:hAnsi="Arial"/>
+                <w:sz w:val="16"/>
+              </w:rPr>
+              <w:t>R-08 (dispatch parcel to tech)</w:t>
+            </w:r>
+          </w:p>
+        </w:tc>
+        <w:tc>
+          <w:tcPr>
+            <w:tcW w:type="dxa" w:w="2154"/>
+          </w:tcPr>
+          <w:p>
+            <w:r>
+              <w:rPr>
+                <w:rFonts w:ascii="Arial" w:hAnsi="Arial"/>
+                <w:sz w:val="16"/>
+              </w:rPr>
+              <w:t>C3 SHIPPING — พัสดุถึง WeeeT: diagnose + repair in-shop</w:t>
+            </w:r>
+          </w:p>
+        </w:tc>
+        <w:tc>
+          <w:tcPr>
+            <w:tcW w:type="dxa" w:w="1587"/>
+          </w:tcPr>
+          <w:p>
+            <w:r>
+              <w:rPr>
+                <w:rFonts w:ascii="Arial" w:hAnsi="Arial"/>
+                <w:sz w:val="16"/>
+              </w:rPr>
+              <w:t>R-08 (ship-back ready)</w:t>
+            </w:r>
+          </w:p>
+        </w:tc>
+        <w:tc>
+          <w:tcPr>
+            <w:tcW w:type="dxa" w:w="1814"/>
+          </w:tcPr>
+          <w:p>
+            <w:r>
+              <w:rPr>
+                <w:rFonts w:ascii="Arial" w:hAnsi="Arial"/>
+                <w:sz w:val="16"/>
+              </w:rPr>
+              <w:t>WeeeR R-08, WeeeU U-53d</w:t>
+            </w:r>
+          </w:p>
+        </w:tc>
+        <w:tc>
+          <w:tcPr>
+            <w:tcW w:type="dxa" w:w="794"/>
+          </w:tcPr>
+          <w:p>
+            <w:r>
+              <w:rPr>
+                <w:rFonts w:ascii="Arial" w:hAnsi="Arial"/>
+                <w:sz w:val="16"/>
+              </w:rPr>
+              <w:t>C3</w:t>
+            </w:r>
+          </w:p>
+        </w:tc>
+        <w:tc>
+          <w:tcPr>
+            <w:tcW w:type="dxa" w:w="1928"/>
+          </w:tcPr>
+          <w:p>
+            <w:r>
+              <w:rPr>
+                <w:rFonts w:ascii="Arial" w:hAnsi="Arial"/>
+                <w:sz w:val="16"/>
+              </w:rPr>
+              <w:t>chain R-08&lt;-&gt;WeeeT</w:t>
+            </w:r>
+          </w:p>
+        </w:tc>
+        <w:tc>
+          <w:tcPr>
+            <w:tcW w:type="dxa" w:w="1134"/>
+          </w:tcPr>
+          <w:p>
+            <w:r>
+              <w:rPr>
+                <w:rFonts w:ascii="Arial" w:hAnsi="Arial"/>
+                <w:sz w:val="16"/>
+              </w:rPr>
+              <w:t>localhost:3003/jobs/[id]/parcel</w:t>
+            </w:r>
+          </w:p>
+        </w:tc>
+      </w:tr>
+      <w:tr>
+        <w:tc>
+          <w:tcPr>
+            <w:tcW w:type="dxa" w:w="1020"/>
+          </w:tcPr>
+          <w:p>
+            <w:r>
+              <w:rPr>
+                <w:rFonts w:ascii="Arial" w:hAnsi="Arial"/>
+                <w:sz w:val="16"/>
+              </w:rPr>
               <w:t>U-53a</w:t>
             </w:r>
           </w:p>
@@ -10026,7 +10282,7 @@
                 <w:rFonts w:ascii="Arial" w:hAnsi="Arial"/>
                 <w:sz w:val="16"/>
               </w:rPr>
-              <w:t>T-02, T-03, T-04, T-15, T-38, T-44</w:t>
+              <w:t>T-02, T-03, T-04, T-15, T-38, T-44, T-45</w:t>
             </w:r>
           </w:p>
         </w:tc>

</xml_diff>